<commit_message>
fix: CaratulaC.docx - ajuste de layout
Co-Authored-By: Claude Sonnet 4.6 <noreply@anthropic.com>
</commit_message>
<xml_diff>
--- a/back/templates/CaratulaC.docx
+++ b/back/templates/CaratulaC.docx
@@ -34,12 +34,12 @@
           <wp:inline distB="114300" distT="114300" distL="114300" distR="114300">
             <wp:extent cx="6232208" cy="3633244"/>
             <wp:effectExtent b="0" l="0" r="0" t="0"/>
-            <wp:docPr id="1" name="image2.png"/>
+            <wp:docPr id="1" name="image1.png"/>
             <a:graphic>
               <a:graphicData uri="http://schemas.openxmlformats.org/drawingml/2006/picture">
                 <pic:pic>
                   <pic:nvPicPr>
-                    <pic:cNvPr id="0" name="image2.png"/>
+                    <pic:cNvPr id="0" name="image1.png"/>
                     <pic:cNvPicPr preferRelativeResize="0"/>
                   </pic:nvPicPr>
                   <pic:blipFill>
@@ -109,41 +109,6 @@
         <w:jc w:val="center"/>
         <w:rPr/>
       </w:pPr>
-      <w:r>
-        <w:rPr/>
-        <w:drawing>
-          <wp:inline distB="0" distT="0" distL="114300" distR="114300">
-            <wp:extent cx="1828800" cy="994052"/>
-            <wp:effectExtent b="0" l="0" r="0" t="0"/>
-            <wp:docPr id="2" name="image1.jpg"/>
-            <a:graphic>
-              <a:graphicData uri="http://schemas.openxmlformats.org/drawingml/2006/picture">
-                <pic:pic>
-                  <pic:nvPicPr>
-                    <pic:cNvPr id="0" name="image1.jpg"/>
-                    <pic:cNvPicPr preferRelativeResize="0"/>
-                  </pic:nvPicPr>
-                  <pic:blipFill>
-                    <a:blip r:embed="rId8"/>
-                    <a:srcRect b="0" l="0" r="0" t="0"/>
-                    <a:stretch>
-                      <a:fillRect/>
-                    </a:stretch>
-                  </pic:blipFill>
-                  <pic:spPr>
-                    <a:xfrm>
-                      <a:off x="0" y="0"/>
-                      <a:ext cx="1828800" cy="994052"/>
-                    </a:xfrm>
-                    <a:prstGeom prst="rect"/>
-                    <a:ln/>
-                  </pic:spPr>
-                </pic:pic>
-              </a:graphicData>
-            </a:graphic>
-          </wp:inline>
-        </w:drawing>
-      </w:r>
       <w:r>
         <w:rPr>
           <w:rtl w:val="0"/>

</xml_diff>